<commit_message>
Update LTP series field to be LNCS
Signed-off-by: Christoph Niethammer <niethammer@hlrs.de>
</commit_message>
<xml_diff>
--- a/assets/SNCS_ProceedingsPaper_LTP_ST_SN_Switzerland_eurompi2026.docx
+++ b/assets/SNCS_ProceedingsPaper_LTP_ST_SN_Switzerland_eurompi2026.docx
@@ -1251,7 +1251,7 @@
                     <w:highlight w:val="lightGray"/>
                     <w:lang w:val="en-GB" w:eastAsia="en-US" w:bidi="ar-SA"/>
                   </w:rPr>
-                  <w:t>Click here to enter text.</w:t>
+                  <w:t>Lecture Notes in Computer Science</w:t>
                 </w:r>
               </w:sdtContent>
             </w:sdt>
@@ -2161,7 +2161,7 @@
     <w:p>
       <w:pPr>
         <w:pStyle w:val="Normal"/>
-        <w:overflowPunct w:val="true"/>
+        <w:overflowPunct w:val="false"/>
         <w:spacing w:lineRule="auto" w:line="240" w:before="120" w:after="120"/>
         <w:textAlignment w:val="baseline"/>
         <w:rPr>
@@ -4990,8 +4990,8 @@
         <w:gridCol w:w="3345"/>
         <w:gridCol w:w="567"/>
         <w:gridCol w:w="3344"/>
-        <w:gridCol w:w="565"/>
-        <w:gridCol w:w="3348"/>
+        <w:gridCol w:w="564"/>
+        <w:gridCol w:w="3349"/>
       </w:tblGrid>
       <w:tr>
         <w:trPr>
@@ -5178,7 +5178,7 @@
         </w:tc>
         <w:tc>
           <w:tcPr>
-            <w:tcW w:w="565" w:type="dxa"/>
+            <w:tcW w:w="564" w:type="dxa"/>
             <w:tcBorders>
               <w:top w:val="nil"/>
               <w:start w:val="nil"/>
@@ -5210,7 +5210,7 @@
         </w:tc>
         <w:tc>
           <w:tcPr>
-            <w:tcW w:w="3348" w:type="dxa"/>
+            <w:tcW w:w="3349" w:type="dxa"/>
             <w:tcBorders>
               <w:top w:val="nil"/>
               <w:start w:val="nil"/>
@@ -5406,7 +5406,7 @@
         </w:tc>
         <w:tc>
           <w:tcPr>
-            <w:tcW w:w="565" w:type="dxa"/>
+            <w:tcW w:w="564" w:type="dxa"/>
             <w:tcBorders>
               <w:top w:val="nil"/>
               <w:bottom w:val="nil"/>
@@ -5436,7 +5436,7 @@
         </w:tc>
         <w:tc>
           <w:tcPr>
-            <w:tcW w:w="3348" w:type="dxa"/>
+            <w:tcW w:w="3349" w:type="dxa"/>
             <w:tcBorders/>
             <w:vAlign w:val="center"/>
           </w:tcPr>

</xml_diff>